<commit_message>
worked on highlighting behavior, minor edits from Carly
</commit_message>
<xml_diff>
--- a/review_docs/RSA Assessment Tool draft language.docx
+++ b/review_docs/RSA Assessment Tool draft language.docx
@@ -1356,6 +1356,44 @@
     <w:p>
       <w:pPr>
         <w:spacing w:before="100" w:beforeAutospacing="1" w:after="100" w:afterAutospacing="1" w:line="240" w:lineRule="auto"/>
+        <w:rPr>
+          <w:rFonts w:ascii="Lato" w:eastAsia="Times New Roman" w:hAnsi="Lato" w:cs="Times New Roman"/>
+          <w:kern w:val="0"/>
+          <w14:ligatures w14:val="none"/>
+        </w:rPr>
+      </w:pPr>
+      <w:r>
+        <w:rPr>
+          <w:rFonts w:ascii="Lato" w:eastAsia="Times New Roman" w:hAnsi="Lato" w:cs="Times New Roman"/>
+          <w:kern w:val="0"/>
+          <w14:ligatures w14:val="none"/>
+        </w:rPr>
+        <w:t>**************************************************************************************</w:t>
+      </w:r>
+    </w:p>
+    <w:p>
+      <w:pPr>
+        <w:spacing w:before="100" w:beforeAutospacing="1" w:after="100" w:afterAutospacing="1" w:line="240" w:lineRule="auto"/>
+        <w:rPr>
+          <w:rFonts w:ascii="Lato" w:eastAsia="Times New Roman" w:hAnsi="Lato" w:cs="Times New Roman"/>
+          <w:kern w:val="0"/>
+          <w14:ligatures w14:val="none"/>
+        </w:rPr>
+      </w:pPr>
+    </w:p>
+    <w:p>
+      <w:pPr>
+        <w:spacing w:before="100" w:beforeAutospacing="1" w:after="100" w:afterAutospacing="1" w:line="240" w:lineRule="auto"/>
+        <w:rPr>
+          <w:rFonts w:ascii="Lato" w:eastAsia="Times New Roman" w:hAnsi="Lato" w:cs="Times New Roman"/>
+          <w:kern w:val="0"/>
+          <w14:ligatures w14:val="none"/>
+        </w:rPr>
+      </w:pPr>
+    </w:p>
+    <w:p>
+      <w:pPr>
+        <w:spacing w:before="100" w:beforeAutospacing="1" w:after="100" w:afterAutospacing="1" w:line="240" w:lineRule="auto"/>
         <w:outlineLvl w:val="1"/>
         <w:rPr>
           <w:rFonts w:ascii="Lato" w:eastAsia="Times New Roman" w:hAnsi="Lato" w:cs="Times New Roman"/>
@@ -1465,6 +1503,7 @@
           <w:kern w:val="0"/>
           <w14:ligatures w14:val="none"/>
         </w:rPr>
+        <w:lastRenderedPageBreak/>
         <w:t xml:space="preserve">The two datasets were developed and revised at different times. Their ecosystem names and categories do not always correspond directly. See Annex A </w:t>
       </w:r>
       <w:r>
@@ -1520,7 +1559,6 @@
           <w:szCs w:val="27"/>
           <w14:ligatures w14:val="none"/>
         </w:rPr>
-        <w:lastRenderedPageBreak/>
         <w:t>Historical native ecosystems</w:t>
       </w:r>
     </w:p>
@@ -1845,6 +1883,7 @@
           <w:kern w:val="0"/>
           <w14:ligatures w14:val="none"/>
         </w:rPr>
+        <w:lastRenderedPageBreak/>
         <w:t>These landscape data may miss or inaccurately map small or rare ecosystems. An ecosystem’s absence from the charts does not establish that it is absent from your management unit or the surrounding landscape.</w:t>
       </w:r>
     </w:p>
@@ -2149,6 +2188,34 @@
     <w:p>
       <w:pPr>
         <w:spacing w:before="100" w:beforeAutospacing="1" w:after="100" w:afterAutospacing="1" w:line="240" w:lineRule="auto"/>
+        <w:rPr>
+          <w:rFonts w:ascii="Lato" w:eastAsia="Times New Roman" w:hAnsi="Lato" w:cs="Times New Roman"/>
+          <w:kern w:val="0"/>
+          <w14:ligatures w14:val="none"/>
+        </w:rPr>
+      </w:pPr>
+    </w:p>
+    <w:p>
+      <w:pPr>
+        <w:spacing w:before="100" w:beforeAutospacing="1" w:after="100" w:afterAutospacing="1" w:line="240" w:lineRule="auto"/>
+        <w:rPr>
+          <w:rFonts w:ascii="Lato" w:eastAsia="Times New Roman" w:hAnsi="Lato" w:cs="Times New Roman"/>
+          <w:kern w:val="0"/>
+          <w14:ligatures w14:val="none"/>
+        </w:rPr>
+      </w:pPr>
+      <w:r>
+        <w:rPr>
+          <w:rFonts w:ascii="Lato" w:eastAsia="Times New Roman" w:hAnsi="Lato" w:cs="Times New Roman"/>
+          <w:kern w:val="0"/>
+          <w14:ligatures w14:val="none"/>
+        </w:rPr>
+        <w:t>*****************************************************</w:t>
+      </w:r>
+    </w:p>
+    <w:p>
+      <w:pPr>
+        <w:spacing w:before="100" w:beforeAutospacing="1" w:after="100" w:afterAutospacing="1" w:line="240" w:lineRule="auto"/>
         <w:outlineLvl w:val="2"/>
         <w:rPr>
           <w:rFonts w:ascii="Lato" w:eastAsia="Times New Roman" w:hAnsi="Lato" w:cs="Times New Roman"/>
@@ -2254,6 +2321,7 @@
           <w:kern w:val="0"/>
           <w14:ligatures w14:val="none"/>
         </w:rPr>
+        <w:lastRenderedPageBreak/>
         <w:t>The percentage beside each historical native ecosystem name is its share of the three modeled areas shown, rather than its share of the entire Ecological Section.</w:t>
       </w:r>
     </w:p>
@@ -2592,6 +2660,7 @@
           <w:kern w:val="0"/>
           <w14:ligatures w14:val="none"/>
         </w:rPr>
+        <w:lastRenderedPageBreak/>
         <w:t>GAP Status 2:</w:t>
       </w:r>
       <w:r>
@@ -2941,6 +3010,7 @@
           <w:kern w:val="0"/>
           <w14:ligatures w14:val="none"/>
         </w:rPr>
+        <w:lastRenderedPageBreak/>
         <w:t>Check the remaining Criterion 6.5 requirements, including restoration provisions and Conservation Areas Network requirements.</w:t>
       </w:r>
     </w:p>
@@ -3024,6 +3094,26 @@
         </w:rPr>
         <w:t>Use local information to identify suitable sites and evaluate restoration feasibility. Check any applicable interim provisions in the US FSS.</w:t>
       </w:r>
+    </w:p>
+    <w:p>
+      <w:pPr>
+        <w:spacing w:before="100" w:beforeAutospacing="1" w:after="100" w:afterAutospacing="1" w:line="240" w:lineRule="auto"/>
+        <w:rPr>
+          <w:rFonts w:ascii="Lato" w:eastAsia="Times New Roman" w:hAnsi="Lato" w:cs="Times New Roman"/>
+          <w:kern w:val="0"/>
+          <w14:ligatures w14:val="none"/>
+        </w:rPr>
+      </w:pPr>
+    </w:p>
+    <w:p>
+      <w:pPr>
+        <w:spacing w:before="100" w:beforeAutospacing="1" w:after="100" w:afterAutospacing="1" w:line="240" w:lineRule="auto"/>
+        <w:rPr>
+          <w:rFonts w:ascii="Lato" w:eastAsia="Times New Roman" w:hAnsi="Lato" w:cs="Times New Roman"/>
+          <w:kern w:val="0"/>
+          <w14:ligatures w14:val="none"/>
+        </w:rPr>
+      </w:pPr>
     </w:p>
     <w:p>
       <w:pPr>
@@ -3133,17 +3223,58 @@
         </w:rPr>
         <w:t xml:space="preserve">Additionally, the LANDFIRE team has put together a </w:t>
       </w:r>
-      <w:hyperlink r:id="rId16" w:history="1">
-        <w:r>
-          <w:rPr>
-            <w:rStyle w:val="Hyperlink"/>
-            <w:rFonts w:ascii="Lato" w:eastAsia="Times New Roman" w:hAnsi="Lato" w:cs="Times New Roman"/>
-            <w:kern w:val="0"/>
-            <w14:ligatures w14:val="none"/>
-          </w:rPr>
-          <w:t>GIS guide that explains how to conduct a succession class analysis on your own using ArcGIS Pro and Microsoft Excel</w:t>
-        </w:r>
-      </w:hyperlink>
+      <w:commentRangeStart w:id="0"/>
+      <w:r>
+        <w:fldChar w:fldCharType="begin"/>
+      </w:r>
+      <w:r>
+        <w:instrText>HYPERLINK "https://thenatureconservancy.github.io/landfire-guide/"</w:instrText>
+      </w:r>
+      <w:r>
+        <w:fldChar w:fldCharType="separate"/>
+      </w:r>
+      <w:r>
+        <w:rPr>
+          <w:rStyle w:val="Hyperlink"/>
+          <w:rFonts w:ascii="Lato" w:eastAsia="Times New Roman" w:hAnsi="Lato" w:cs="Times New Roman"/>
+          <w:kern w:val="0"/>
+          <w14:ligatures w14:val="none"/>
+        </w:rPr>
+        <w:t>GIS guide that explains how to conduct a succession class analysis on your own using ArcGIS Pro and Mi</w:t>
+      </w:r>
+      <w:r>
+        <w:rPr>
+          <w:rStyle w:val="Hyperlink"/>
+          <w:rFonts w:ascii="Lato" w:eastAsia="Times New Roman" w:hAnsi="Lato" w:cs="Times New Roman"/>
+          <w:kern w:val="0"/>
+          <w14:ligatures w14:val="none"/>
+        </w:rPr>
+        <w:t>c</w:t>
+      </w:r>
+      <w:r>
+        <w:rPr>
+          <w:rStyle w:val="Hyperlink"/>
+          <w:rFonts w:ascii="Lato" w:eastAsia="Times New Roman" w:hAnsi="Lato" w:cs="Times New Roman"/>
+          <w:kern w:val="0"/>
+          <w14:ligatures w14:val="none"/>
+        </w:rPr>
+        <w:t>rosoft Excel</w:t>
+      </w:r>
+      <w:r>
+        <w:fldChar w:fldCharType="end"/>
+      </w:r>
+      <w:commentRangeEnd w:id="0"/>
+      <w:r>
+        <w:rPr>
+          <w:rStyle w:val="CommentReference"/>
+          <w:rFonts w:ascii="Lato" w:eastAsia="Times New Roman" w:hAnsi="Lato" w:cs="Times New Roman"/>
+          <w:kern w:val="0"/>
+          <w:sz w:val="24"/>
+          <w:szCs w:val="24"/>
+          <w14:ligatures w14:val="none"/>
+        </w:rPr>
+        <w:commentReference w:id="0"/>
+      </w:r>
       <w:r>
         <w:rPr>
           <w:rFonts w:ascii="Lato" w:eastAsia="Times New Roman" w:hAnsi="Lato" w:cs="Times New Roman"/>
@@ -3231,6 +3362,7 @@
           <w:kern w:val="0"/>
           <w14:ligatures w14:val="none"/>
         </w:rPr>
+        <w:lastRenderedPageBreak/>
         <w:t>Use this comparison to investigate stages that are less common today than the model would suggest. The stage with the smallest current percentage is not necessarily underrepresented; its reference percentage may also be small.</w:t>
       </w:r>
     </w:p>
@@ -3601,6 +3733,34 @@
     <w:p>
       <w:pPr>
         <w:spacing w:before="100" w:beforeAutospacing="1" w:after="100" w:afterAutospacing="1" w:line="240" w:lineRule="auto"/>
+        <w:rPr>
+          <w:rFonts w:ascii="Lato" w:eastAsia="Times New Roman" w:hAnsi="Lato" w:cs="Times New Roman"/>
+          <w:kern w:val="0"/>
+          <w14:ligatures w14:val="none"/>
+        </w:rPr>
+      </w:pPr>
+    </w:p>
+    <w:p>
+      <w:pPr>
+        <w:spacing w:before="100" w:beforeAutospacing="1" w:after="100" w:afterAutospacing="1" w:line="240" w:lineRule="auto"/>
+        <w:rPr>
+          <w:rFonts w:ascii="Lato" w:eastAsia="Times New Roman" w:hAnsi="Lato" w:cs="Times New Roman"/>
+          <w:kern w:val="0"/>
+          <w14:ligatures w14:val="none"/>
+        </w:rPr>
+      </w:pPr>
+      <w:r>
+        <w:rPr>
+          <w:rFonts w:ascii="Lato" w:eastAsia="Times New Roman" w:hAnsi="Lato" w:cs="Times New Roman"/>
+          <w:kern w:val="0"/>
+          <w14:ligatures w14:val="none"/>
+        </w:rPr>
+        <w:t>*********************************</w:t>
+      </w:r>
+    </w:p>
+    <w:p>
+      <w:pPr>
+        <w:spacing w:before="100" w:beforeAutospacing="1" w:after="100" w:afterAutospacing="1" w:line="240" w:lineRule="auto"/>
         <w:outlineLvl w:val="1"/>
         <w:rPr>
           <w:rFonts w:ascii="Lato" w:eastAsia="Times New Roman" w:hAnsi="Lato" w:cs="Times New Roman"/>
@@ -3612,6 +3772,7 @@
           <w14:ligatures w14:val="none"/>
         </w:rPr>
       </w:pPr>
+      <w:commentRangeStart w:id="1"/>
       <w:r>
         <w:rPr>
           <w:rFonts w:ascii="Lato" w:eastAsia="Times New Roman" w:hAnsi="Lato" w:cs="Times New Roman"/>
@@ -3622,6 +3783,7 @@
           <w:szCs w:val="36"/>
           <w14:ligatures w14:val="none"/>
         </w:rPr>
+        <w:lastRenderedPageBreak/>
         <w:t>Annex A</w:t>
       </w:r>
     </w:p>
@@ -3878,6 +4040,18 @@
           <w14:ligatures w14:val="none"/>
         </w:rPr>
         <w:t>.</w:t>
+      </w:r>
+      <w:commentRangeEnd w:id="1"/>
+      <w:r>
+        <w:rPr>
+          <w:rStyle w:val="CommentReference"/>
+          <w:rFonts w:ascii="Lato" w:eastAsia="Times New Roman" w:hAnsi="Lato" w:cs="Times New Roman"/>
+          <w:kern w:val="0"/>
+          <w:sz w:val="24"/>
+          <w:szCs w:val="24"/>
+          <w14:ligatures w14:val="none"/>
+        </w:rPr>
+        <w:commentReference w:id="1"/>
       </w:r>
     </w:p>
     <w:p>
@@ -3953,6 +4127,7 @@
           <w:sz w:val="26"/>
           <w:szCs w:val="26"/>
         </w:rPr>
+        <w:lastRenderedPageBreak/>
         <w:t>To better understand ‘reference’ conditions for the Historic Native Ecosystems of the US, the LANDFIRE program developed descriptions plus accompanying state-and-transition models that depict how these systems ‘looked and functioned’ with natural disturbance regimes. Below you can download the descriptions for this section’s Native Ecosystems and explore the succession class descriptions in a table.</w:t>
       </w:r>
     </w:p>
@@ -4022,6 +4197,64 @@
     </w:sectPr>
   </w:body>
 </w:document>
+</file>
+
+<file path=word/comments.xml><?xml version="1.0" encoding="utf-8"?>
+<w:comments xmlns:wpc="http://schemas.microsoft.com/office/word/2010/wordprocessingCanvas" xmlns:cx="http://schemas.microsoft.com/office/drawing/2014/chartex" xmlns:cx1="http://schemas.microsoft.com/office/drawing/2015/9/8/chartex" xmlns:cx2="http://schemas.microsoft.com/office/drawing/2015/10/21/chartex" xmlns:cx3="http://schemas.microsoft.com/office/drawing/2016/5/9/chartex" xmlns:cx4="http://schemas.microsoft.com/office/drawing/2016/5/10/chartex" xmlns:cx5="http://schemas.microsoft.com/office/drawing/2016/5/11/chartex" xmlns:cx6="http://schemas.microsoft.com/office/drawing/2016/5/12/chartex" xmlns:cx7="http://schemas.microsoft.com/office/drawing/2016/5/13/chartex" xmlns:cx8="http://schemas.microsoft.com/office/drawing/2016/5/14/chartex" xmlns:mc="http://schemas.openxmlformats.org/markup-compatibility/2006" xmlns:aink="http://schemas.microsoft.com/office/drawing/2016/ink" xmlns:am3d="http://schemas.microsoft.com/office/drawing/2017/model3d" xmlns:o="urn:schemas-microsoft-com:office:office" xmlns:oel="http://schemas.microsoft.com/office/2019/extlst" xmlns:r="http://schemas.openxmlformats.org/officeDocument/2006/relationships" xmlns:m="http://schemas.openxmlformats.org/officeDocument/2006/math" xmlns:v="urn:schemas-microsoft-com:vml" xmlns:wp14="http://schemas.microsoft.com/office/word/2010/wordprocessingDrawing" xmlns:wp="http://schemas.openxmlformats.org/drawingml/2006/wordprocessingDrawing" xmlns:w10="urn:schemas-microsoft-com:office:word" xmlns:w="http://schemas.openxmlformats.org/wordprocessingml/2006/main" xmlns:w14="http://schemas.microsoft.com/office/word/2010/wordml" xmlns:w15="http://schemas.microsoft.com/office/word/2012/wordml" xmlns:w16cex="http://schemas.microsoft.com/office/word/2018/wordml/cex" xmlns:w16cid="http://schemas.microsoft.com/office/word/2016/wordml/cid" xmlns:w16="http://schemas.microsoft.com/office/word/2018/wordml" xmlns:w16du="http://schemas.microsoft.com/office/word/2023/wordml/word16du" xmlns:w16sdtdh="http://schemas.microsoft.com/office/word/2020/wordml/sdtdatahash" xmlns:w16sdtfl="http://schemas.microsoft.com/office/word/2024/wordml/sdtformatlock" xmlns:w16se="http://schemas.microsoft.com/office/word/2015/wordml/symex" xmlns:wpg="http://schemas.microsoft.com/office/word/2010/wordprocessingGroup" xmlns:wpi="http://schemas.microsoft.com/office/word/2010/wordprocessingInk" xmlns:wne="http://schemas.microsoft.com/office/word/2006/wordml" xmlns:wps="http://schemas.microsoft.com/office/word/2010/wordprocessingShape" mc:Ignorable="w14 w15 w16se w16cid w16 w16cex w16sdtdh w16sdtfl w16du wp14">
+  <w:comment w:id="0" w:author="Randy Swaty" w:date="2026-10-14T10:48:00Z" w:initials="RS">
+    <w:p>
+      <w:pPr>
+        <w:pStyle w:val="CommentText"/>
+      </w:pPr>
+      <w:r>
+        <w:rPr>
+          <w:rStyle w:val="CommentReference"/>
+        </w:rPr>
+        <w:annotationRef/>
+      </w:r>
+      <w:r>
+        <w:t>Added CDL link</w:t>
+      </w:r>
+    </w:p>
+  </w:comment>
+  <w:comment w:id="1" w:author="Randy Swaty" w:date="2026-10-14T10:45:00Z" w:initials="RS">
+    <w:p>
+      <w:pPr>
+        <w:pStyle w:val="CommentText"/>
+      </w:pPr>
+      <w:r>
+        <w:rPr>
+          <w:rStyle w:val="CommentReference"/>
+        </w:rPr>
+        <w:annotationRef/>
+      </w:r>
+      <w:r>
+        <w:t>Formatted this a little differently</w:t>
+      </w:r>
+    </w:p>
+  </w:comment>
+</w:comments>
+</file>
+
+<file path=word/commentsExtended.xml><?xml version="1.0" encoding="utf-8"?>
+<w15:commentsEx xmlns:wpc="http://schemas.microsoft.com/office/word/2010/wordprocessingCanvas" xmlns:cx="http://schemas.microsoft.com/office/drawing/2014/chartex" xmlns:cx1="http://schemas.microsoft.com/office/drawing/2015/9/8/chartex" xmlns:cx2="http://schemas.microsoft.com/office/drawing/2015/10/21/chartex" xmlns:cx3="http://schemas.microsoft.com/office/drawing/2016/5/9/chartex" xmlns:cx4="http://schemas.microsoft.com/office/drawing/2016/5/10/chartex" xmlns:cx5="http://schemas.microsoft.com/office/drawing/2016/5/11/chartex" xmlns:cx6="http://schemas.microsoft.com/office/drawing/2016/5/12/chartex" xmlns:cx7="http://schemas.microsoft.com/office/drawing/2016/5/13/chartex" xmlns:cx8="http://schemas.microsoft.com/office/drawing/2016/5/14/chartex" xmlns:mc="http://schemas.openxmlformats.org/markup-compatibility/2006" xmlns:aink="http://schemas.microsoft.com/office/drawing/2016/ink" xmlns:am3d="http://schemas.microsoft.com/office/drawing/2017/model3d" xmlns:o="urn:schemas-microsoft-com:office:office" xmlns:oel="http://schemas.microsoft.com/office/2019/extlst" xmlns:r="http://schemas.openxmlformats.org/officeDocument/2006/relationships" xmlns:m="http://schemas.openxmlformats.org/officeDocument/2006/math" xmlns:v="urn:schemas-microsoft-com:vml" xmlns:wp14="http://schemas.microsoft.com/office/word/2010/wordprocessingDrawing" xmlns:wp="http://schemas.openxmlformats.org/drawingml/2006/wordprocessingDrawing" xmlns:w10="urn:schemas-microsoft-com:office:word" xmlns:w="http://schemas.openxmlformats.org/wordprocessingml/2006/main" xmlns:w14="http://schemas.microsoft.com/office/word/2010/wordml" xmlns:w15="http://schemas.microsoft.com/office/word/2012/wordml" xmlns:w16cex="http://schemas.microsoft.com/office/word/2018/wordml/cex" xmlns:w16cid="http://schemas.microsoft.com/office/word/2016/wordml/cid" xmlns:w16="http://schemas.microsoft.com/office/word/2018/wordml" xmlns:w16du="http://schemas.microsoft.com/office/word/2023/wordml/word16du" xmlns:w16sdtdh="http://schemas.microsoft.com/office/word/2020/wordml/sdtdatahash" xmlns:w16sdtfl="http://schemas.microsoft.com/office/word/2024/wordml/sdtformatlock" xmlns:w16se="http://schemas.microsoft.com/office/word/2015/wordml/symex" xmlns:wpg="http://schemas.microsoft.com/office/word/2010/wordprocessingGroup" xmlns:wpi="http://schemas.microsoft.com/office/word/2010/wordprocessingInk" xmlns:wne="http://schemas.microsoft.com/office/word/2006/wordml" xmlns:wps="http://schemas.microsoft.com/office/word/2010/wordprocessingShape" mc:Ignorable="w14 w15 w16se w16cid w16 w16cex w16sdtdh w16sdtfl w16du wp14">
+  <w15:commentEx w15:paraId="3C2A824B" w15:done="0"/>
+  <w15:commentEx w15:paraId="01407266" w15:done="0"/>
+</w15:commentsEx>
+</file>
+
+<file path=word/commentsExtensible.xml><?xml version="1.0" encoding="utf-8"?>
+<w16cex:commentsExtensible xmlns:wpc="http://schemas.microsoft.com/office/word/2010/wordprocessingCanvas" xmlns:cx="http://schemas.microsoft.com/office/drawing/2014/chartex" xmlns:cx1="http://schemas.microsoft.com/office/drawing/2015/9/8/chartex" xmlns:cx2="http://schemas.microsoft.com/office/drawing/2015/10/21/chartex" xmlns:cx3="http://schemas.microsoft.com/office/drawing/2016/5/9/chartex" xmlns:cx4="http://schemas.microsoft.com/office/drawing/2016/5/10/chartex" xmlns:cx5="http://schemas.microsoft.com/office/drawing/2016/5/11/chartex" xmlns:cx6="http://schemas.microsoft.com/office/drawing/2016/5/12/chartex" xmlns:cx7="http://schemas.microsoft.com/office/drawing/2016/5/13/chartex" xmlns:cx8="http://schemas.microsoft.com/office/drawing/2016/5/14/chartex" xmlns:cr="http://schemas.microsoft.com/office/comments/2020/reactions" xmlns:mc="http://schemas.openxmlformats.org/markup-compatibility/2006" xmlns:aink="http://schemas.microsoft.com/office/drawing/2016/ink" xmlns:am3d="http://schemas.microsoft.com/office/drawing/2017/model3d" xmlns:o="urn:schemas-microsoft-com:office:office" xmlns:oel="http://schemas.microsoft.com/office/2019/extlst" xmlns:r="http://schemas.openxmlformats.org/officeDocument/2006/relationships" xmlns:m="http://schemas.openxmlformats.org/officeDocument/2006/math" xmlns:v="urn:schemas-microsoft-com:vml" xmlns:wp14="http://schemas.microsoft.com/office/word/2010/wordprocessingDrawing" xmlns:wp="http://schemas.openxmlformats.org/drawingml/2006/wordprocessingDrawing" xmlns:w10="urn:schemas-microsoft-com:office:word" xmlns:w="http://schemas.openxmlformats.org/wordprocessingml/2006/main" xmlns:w14="http://schemas.microsoft.com/office/word/2010/wordml" xmlns:w15="http://schemas.microsoft.com/office/word/2012/wordml" xmlns:w16cex="http://schemas.microsoft.com/office/word/2018/wordml/cex" xmlns:w16cid="http://schemas.microsoft.com/office/word/2016/wordml/cid" xmlns:w16="http://schemas.microsoft.com/office/word/2018/wordml" xmlns:w16du="http://schemas.microsoft.com/office/word/2023/wordml/word16du" xmlns:w16sdtdh="http://schemas.microsoft.com/office/word/2020/wordml/sdtdatahash" xmlns:w16sdtfl="http://schemas.microsoft.com/office/word/2024/wordml/sdtformatlock" xmlns:w16se="http://schemas.microsoft.com/office/word/2015/wordml/symex" xmlns:wpg="http://schemas.microsoft.com/office/word/2010/wordprocessingGroup" xmlns:wpi="http://schemas.microsoft.com/office/word/2010/wordprocessingInk" xmlns:wne="http://schemas.microsoft.com/office/word/2006/wordml" xmlns:wps="http://schemas.microsoft.com/office/word/2010/wordprocessingShape" mc:Ignorable="w14 w15 w16se w16cid w16 w16cex w16sdtdh w16sdtfl cr w16du wp14">
+  <w16cex:commentExtensible w16cex:durableId="06D8F712" w16cex:dateUtc="2026-10-14T14:48:00Z"/>
+  <w16cex:commentExtensible w16cex:durableId="155AD746" w16cex:dateUtc="2026-10-14T14:45:00Z"/>
+</w16cex:commentsExtensible>
+</file>
+
+<file path=word/commentsIds.xml><?xml version="1.0" encoding="utf-8"?>
+<w16cid:commentsIds xmlns:wpc="http://schemas.microsoft.com/office/word/2010/wordprocessingCanvas" xmlns:cx="http://schemas.microsoft.com/office/drawing/2014/chartex" xmlns:cx1="http://schemas.microsoft.com/office/drawing/2015/9/8/chartex" xmlns:cx2="http://schemas.microsoft.com/office/drawing/2015/10/21/chartex" xmlns:cx3="http://schemas.microsoft.com/office/drawing/2016/5/9/chartex" xmlns:cx4="http://schemas.microsoft.com/office/drawing/2016/5/10/chartex" xmlns:cx5="http://schemas.microsoft.com/office/drawing/2016/5/11/chartex" xmlns:cx6="http://schemas.microsoft.com/office/drawing/2016/5/12/chartex" xmlns:cx7="http://schemas.microsoft.com/office/drawing/2016/5/13/chartex" xmlns:cx8="http://schemas.microsoft.com/office/drawing/2016/5/14/chartex" xmlns:mc="http://schemas.openxmlformats.org/markup-compatibility/2006" xmlns:aink="http://schemas.microsoft.com/office/drawing/2016/ink" xmlns:am3d="http://schemas.microsoft.com/office/drawing/2017/model3d" xmlns:o="urn:schemas-microsoft-com:office:office" xmlns:oel="http://schemas.microsoft.com/office/2019/extlst" xmlns:r="http://schemas.openxmlformats.org/officeDocument/2006/relationships" xmlns:m="http://schemas.openxmlformats.org/officeDocument/2006/math" xmlns:v="urn:schemas-microsoft-com:vml" xmlns:wp14="http://schemas.microsoft.com/office/word/2010/wordprocessingDrawing" xmlns:wp="http://schemas.openxmlformats.org/drawingml/2006/wordprocessingDrawing" xmlns:w10="urn:schemas-microsoft-com:office:word" xmlns:w="http://schemas.openxmlformats.org/wordprocessingml/2006/main" xmlns:w14="http://schemas.microsoft.com/office/word/2010/wordml" xmlns:w15="http://schemas.microsoft.com/office/word/2012/wordml" xmlns:w16cex="http://schemas.microsoft.com/office/word/2018/wordml/cex" xmlns:w16cid="http://schemas.microsoft.com/office/word/2016/wordml/cid" xmlns:w16="http://schemas.microsoft.com/office/word/2018/wordml" xmlns:w16du="http://schemas.microsoft.com/office/word/2023/wordml/word16du" xmlns:w16sdtdh="http://schemas.microsoft.com/office/word/2020/wordml/sdtdatahash" xmlns:w16sdtfl="http://schemas.microsoft.com/office/word/2024/wordml/sdtformatlock" xmlns:w16se="http://schemas.microsoft.com/office/word/2015/wordml/symex" xmlns:wpg="http://schemas.microsoft.com/office/word/2010/wordprocessingGroup" xmlns:wpi="http://schemas.microsoft.com/office/word/2010/wordprocessingInk" xmlns:wne="http://schemas.microsoft.com/office/word/2006/wordml" xmlns:wps="http://schemas.microsoft.com/office/word/2010/wordprocessingShape" mc:Ignorable="w14 w15 w16se w16cid w16 w16cex w16sdtdh w16sdtfl w16du wp14">
+  <w16cid:commentId w16cid:paraId="3C2A824B" w16cid:durableId="06D8F712"/>
+  <w16cid:commentId w16cid:paraId="01407266" w16cid:durableId="155AD746"/>
+</w16cid:commentsIds>
 </file>
 
 <file path=word/numbering.xml><?xml version="1.0" encoding="utf-8"?>
@@ -5451,6 +5684,14 @@
     <w:abstractNumId w:val="4"/>
   </w:num>
 </w:numbering>
+</file>
+
+<file path=word/people.xml><?xml version="1.0" encoding="utf-8"?>
+<w15:people xmlns:wpc="http://schemas.microsoft.com/office/word/2010/wordprocessingCanvas" xmlns:cx="http://schemas.microsoft.com/office/drawing/2014/chartex" xmlns:cx1="http://schemas.microsoft.com/office/drawing/2015/9/8/chartex" xmlns:cx2="http://schemas.microsoft.com/office/drawing/2015/10/21/chartex" xmlns:cx3="http://schemas.microsoft.com/office/drawing/2016/5/9/chartex" xmlns:cx4="http://schemas.microsoft.com/office/drawing/2016/5/10/chartex" xmlns:cx5="http://schemas.microsoft.com/office/drawing/2016/5/11/chartex" xmlns:cx6="http://schemas.microsoft.com/office/drawing/2016/5/12/chartex" xmlns:cx7="http://schemas.microsoft.com/office/drawing/2016/5/13/chartex" xmlns:cx8="http://schemas.microsoft.com/office/drawing/2016/5/14/chartex" xmlns:mc="http://schemas.openxmlformats.org/markup-compatibility/2006" xmlns:aink="http://schemas.microsoft.com/office/drawing/2016/ink" xmlns:am3d="http://schemas.microsoft.com/office/drawing/2017/model3d" xmlns:o="urn:schemas-microsoft-com:office:office" xmlns:oel="http://schemas.microsoft.com/office/2019/extlst" xmlns:r="http://schemas.openxmlformats.org/officeDocument/2006/relationships" xmlns:m="http://schemas.openxmlformats.org/officeDocument/2006/math" xmlns:v="urn:schemas-microsoft-com:vml" xmlns:wp14="http://schemas.microsoft.com/office/word/2010/wordprocessingDrawing" xmlns:wp="http://schemas.openxmlformats.org/drawingml/2006/wordprocessingDrawing" xmlns:w10="urn:schemas-microsoft-com:office:word" xmlns:w="http://schemas.openxmlformats.org/wordprocessingml/2006/main" xmlns:w14="http://schemas.microsoft.com/office/word/2010/wordml" xmlns:w15="http://schemas.microsoft.com/office/word/2012/wordml" xmlns:w16cex="http://schemas.microsoft.com/office/word/2018/wordml/cex" xmlns:w16cid="http://schemas.microsoft.com/office/word/2016/wordml/cid" xmlns:w16="http://schemas.microsoft.com/office/word/2018/wordml" xmlns:w16du="http://schemas.microsoft.com/office/word/2023/wordml/word16du" xmlns:w16sdtdh="http://schemas.microsoft.com/office/word/2020/wordml/sdtdatahash" xmlns:w16sdtfl="http://schemas.microsoft.com/office/word/2024/wordml/sdtformatlock" xmlns:w16se="http://schemas.microsoft.com/office/word/2015/wordml/symex" xmlns:wpg="http://schemas.microsoft.com/office/word/2010/wordprocessingGroup" xmlns:wpi="http://schemas.microsoft.com/office/word/2010/wordprocessingInk" xmlns:wne="http://schemas.microsoft.com/office/word/2006/wordml" xmlns:wps="http://schemas.microsoft.com/office/word/2010/wordprocessingShape" mc:Ignorable="w14 w15 w16se w16cid w16 w16cex w16sdtdh w16sdtfl w16du wp14">
+  <w15:person w15:author="Randy Swaty">
+    <w15:presenceInfo w15:providerId="AD" w15:userId="S::rswaty@TNC.ORG::d0e7f8b8-690d-4238-b5af-c901ac01b073"/>
+  </w15:person>
+</w15:people>
 </file>
 
 <file path=word/styles.xml><?xml version="1.0" encoding="utf-8"?>
@@ -6461,6 +6702,72 @@
       <w:u w:val="single"/>
     </w:rPr>
   </w:style>
+  <w:style w:type="character" w:styleId="CommentReference">
+    <w:name w:val="annotation reference"/>
+    <w:basedOn w:val="DefaultParagraphFont"/>
+    <w:uiPriority w:val="99"/>
+    <w:semiHidden/>
+    <w:unhideWhenUsed/>
+    <w:rsid w:val="00CF1755"/>
+    <w:rPr>
+      <w:sz w:val="16"/>
+      <w:szCs w:val="16"/>
+    </w:rPr>
+  </w:style>
+  <w:style w:type="paragraph" w:styleId="CommentText">
+    <w:name w:val="annotation text"/>
+    <w:basedOn w:val="Normal"/>
+    <w:link w:val="CommentTextChar"/>
+    <w:uiPriority w:val="99"/>
+    <w:unhideWhenUsed/>
+    <w:rsid w:val="00CF1755"/>
+    <w:pPr>
+      <w:spacing w:line="240" w:lineRule="auto"/>
+    </w:pPr>
+    <w:rPr>
+      <w:sz w:val="20"/>
+      <w:szCs w:val="20"/>
+    </w:rPr>
+  </w:style>
+  <w:style w:type="character" w:customStyle="1" w:styleId="CommentTextChar">
+    <w:name w:val="Comment Text Char"/>
+    <w:basedOn w:val="DefaultParagraphFont"/>
+    <w:link w:val="CommentText"/>
+    <w:uiPriority w:val="99"/>
+    <w:rsid w:val="00CF1755"/>
+    <w:rPr>
+      <w:sz w:val="20"/>
+      <w:szCs w:val="20"/>
+    </w:rPr>
+  </w:style>
+  <w:style w:type="paragraph" w:styleId="CommentSubject">
+    <w:name w:val="annotation subject"/>
+    <w:basedOn w:val="CommentText"/>
+    <w:next w:val="CommentText"/>
+    <w:link w:val="CommentSubjectChar"/>
+    <w:uiPriority w:val="99"/>
+    <w:semiHidden/>
+    <w:unhideWhenUsed/>
+    <w:rsid w:val="00CF1755"/>
+    <w:rPr>
+      <w:b/>
+      <w:bCs/>
+    </w:rPr>
+  </w:style>
+  <w:style w:type="character" w:customStyle="1" w:styleId="CommentSubjectChar">
+    <w:name w:val="Comment Subject Char"/>
+    <w:basedOn w:val="CommentTextChar"/>
+    <w:link w:val="CommentSubject"/>
+    <w:uiPriority w:val="99"/>
+    <w:semiHidden/>
+    <w:rsid w:val="00CF1755"/>
+    <w:rPr>
+      <w:b/>
+      <w:bCs/>
+      <w:sz w:val="20"/>
+      <w:szCs w:val="20"/>
+    </w:rPr>
+  </w:style>
 </w:styles>
 </file>
 

</xml_diff>